<commit_message>
thêm quản lí blog/news
</commit_message>
<xml_diff>
--- a/chi tiết database.docx
+++ b/chi tiết database.docx
@@ -6,6 +6,9 @@
       <w:pPr>
         <w:pStyle w:val="Heading3"/>
       </w:pPr>
+      <w:r>
+        <w:t>F</w:t>
+      </w:r>
       <w:r>
         <w:t>1. LOGIC ĐĂNG KÝ SALON (PARTNER)</w:t>
       </w:r>
@@ -348,7 +351,7 @@
     <w:p>
       <w:r>
         <w:pict w14:anchorId="4DDD36B1">
-          <v:rect id="_x0000_i1124" style="width:0;height:1.5pt" o:hralign="center" o:hrstd="t" o:hr="t" fillcolor="#a0a0a0" stroked="f"/>
+          <v:rect id="_x0000_i1025" style="width:0;height:1.5pt" o:hralign="center" o:hrstd="t" o:hr="t" fillcolor="#a0a0a0" stroked="f"/>
         </w:pict>
       </w:r>
     </w:p>
@@ -924,7 +927,7 @@
           <w:color w:val="1F1F1F"/>
         </w:rPr>
         <w:pict w14:anchorId="399914B8">
-          <v:rect id="_x0000_i1125" style="width:0;height:1.5pt" o:hralign="center" o:hrstd="t" o:hrnoshade="t" o:hr="t" fillcolor="gray" stroked="f"/>
+          <v:rect id="_x0000_i1026" style="width:0;height:1.5pt" o:hralign="center" o:hrstd="t" o:hrnoshade="t" o:hr="t" fillcolor="gray" stroked="f"/>
         </w:pict>
       </w:r>
     </w:p>
@@ -1140,7 +1143,7 @@
           <w:color w:val="1F1F1F"/>
         </w:rPr>
         <w:pict w14:anchorId="40BCA96A">
-          <v:rect id="_x0000_i1126" style="width:0;height:1.5pt" o:hralign="center" o:hrstd="t" o:hrnoshade="t" o:hr="t" fillcolor="gray" stroked="f"/>
+          <v:rect id="_x0000_i1027" style="width:0;height:1.5pt" o:hralign="center" o:hrstd="t" o:hrnoshade="t" o:hr="t" fillcolor="gray" stroked="f"/>
         </w:pict>
       </w:r>
     </w:p>
@@ -1365,7 +1368,7 @@
         </w:trPr>
         <w:tc>
           <w:tcPr>
-            <w:tcW w:w="0" w:type="auto"/>
+            <w:tcW w:w="1951" w:type="dxa"/>
             <w:tcBorders>
               <w:top w:val="single" w:sz="6" w:space="0" w:color="auto"/>
               <w:left w:val="single" w:sz="6" w:space="0" w:color="auto"/>
@@ -1400,7 +1403,7 @@
         </w:tc>
         <w:tc>
           <w:tcPr>
-            <w:tcW w:w="0" w:type="auto"/>
+            <w:tcW w:w="1152" w:type="dxa"/>
             <w:tcBorders>
               <w:top w:val="single" w:sz="6" w:space="0" w:color="auto"/>
               <w:left w:val="single" w:sz="6" w:space="0" w:color="auto"/>
@@ -1504,7 +1507,7 @@
         </w:trPr>
         <w:tc>
           <w:tcPr>
-            <w:tcW w:w="0" w:type="auto"/>
+            <w:tcW w:w="1951" w:type="dxa"/>
             <w:tcBorders>
               <w:top w:val="single" w:sz="6" w:space="0" w:color="auto"/>
               <w:left w:val="single" w:sz="6" w:space="0" w:color="auto"/>
@@ -1539,7 +1542,7 @@
         </w:tc>
         <w:tc>
           <w:tcPr>
-            <w:tcW w:w="0" w:type="auto"/>
+            <w:tcW w:w="1152" w:type="dxa"/>
             <w:tcBorders>
               <w:top w:val="single" w:sz="6" w:space="0" w:color="auto"/>
               <w:left w:val="single" w:sz="6" w:space="0" w:color="auto"/>
@@ -1652,7 +1655,7 @@
         </w:trPr>
         <w:tc>
           <w:tcPr>
-            <w:tcW w:w="0" w:type="auto"/>
+            <w:tcW w:w="1951" w:type="dxa"/>
             <w:tcBorders>
               <w:top w:val="single" w:sz="6" w:space="0" w:color="auto"/>
               <w:left w:val="single" w:sz="6" w:space="0" w:color="auto"/>
@@ -1687,7 +1690,7 @@
         </w:tc>
         <w:tc>
           <w:tcPr>
-            <w:tcW w:w="0" w:type="auto"/>
+            <w:tcW w:w="1152" w:type="dxa"/>
             <w:tcBorders>
               <w:top w:val="single" w:sz="6" w:space="0" w:color="auto"/>
               <w:left w:val="single" w:sz="6" w:space="0" w:color="auto"/>
@@ -1791,7 +1794,7 @@
         </w:trPr>
         <w:tc>
           <w:tcPr>
-            <w:tcW w:w="0" w:type="auto"/>
+            <w:tcW w:w="1951" w:type="dxa"/>
             <w:tcBorders>
               <w:top w:val="single" w:sz="6" w:space="0" w:color="auto"/>
               <w:left w:val="single" w:sz="6" w:space="0" w:color="auto"/>
@@ -1826,7 +1829,7 @@
         </w:tc>
         <w:tc>
           <w:tcPr>
-            <w:tcW w:w="0" w:type="auto"/>
+            <w:tcW w:w="1152" w:type="dxa"/>
             <w:tcBorders>
               <w:top w:val="single" w:sz="6" w:space="0" w:color="auto"/>
               <w:left w:val="single" w:sz="6" w:space="0" w:color="auto"/>
@@ -1930,7 +1933,7 @@
         </w:trPr>
         <w:tc>
           <w:tcPr>
-            <w:tcW w:w="0" w:type="auto"/>
+            <w:tcW w:w="1951" w:type="dxa"/>
             <w:tcBorders>
               <w:top w:val="single" w:sz="6" w:space="0" w:color="auto"/>
               <w:left w:val="single" w:sz="6" w:space="0" w:color="auto"/>
@@ -1965,7 +1968,7 @@
         </w:tc>
         <w:tc>
           <w:tcPr>
-            <w:tcW w:w="0" w:type="auto"/>
+            <w:tcW w:w="1152" w:type="dxa"/>
             <w:tcBorders>
               <w:top w:val="single" w:sz="6" w:space="0" w:color="auto"/>
               <w:left w:val="single" w:sz="6" w:space="0" w:color="auto"/>
@@ -2078,7 +2081,7 @@
         </w:trPr>
         <w:tc>
           <w:tcPr>
-            <w:tcW w:w="0" w:type="auto"/>
+            <w:tcW w:w="1951" w:type="dxa"/>
             <w:tcBorders>
               <w:top w:val="single" w:sz="6" w:space="0" w:color="auto"/>
               <w:left w:val="single" w:sz="6" w:space="0" w:color="auto"/>
@@ -2113,7 +2116,7 @@
         </w:tc>
         <w:tc>
           <w:tcPr>
-            <w:tcW w:w="0" w:type="auto"/>
+            <w:tcW w:w="1152" w:type="dxa"/>
             <w:tcBorders>
               <w:top w:val="single" w:sz="6" w:space="0" w:color="auto"/>
               <w:left w:val="single" w:sz="6" w:space="0" w:color="auto"/>
@@ -2242,7 +2245,7 @@
         </w:trPr>
         <w:tc>
           <w:tcPr>
-            <w:tcW w:w="0" w:type="auto"/>
+            <w:tcW w:w="1951" w:type="dxa"/>
             <w:tcBorders>
               <w:top w:val="single" w:sz="6" w:space="0" w:color="auto"/>
               <w:left w:val="single" w:sz="6" w:space="0" w:color="auto"/>
@@ -2277,7 +2280,7 @@
         </w:tc>
         <w:tc>
           <w:tcPr>
-            <w:tcW w:w="0" w:type="auto"/>
+            <w:tcW w:w="1152" w:type="dxa"/>
             <w:tcBorders>
               <w:top w:val="single" w:sz="6" w:space="0" w:color="auto"/>
               <w:left w:val="single" w:sz="6" w:space="0" w:color="auto"/>
@@ -2381,7 +2384,7 @@
         </w:trPr>
         <w:tc>
           <w:tcPr>
-            <w:tcW w:w="0" w:type="auto"/>
+            <w:tcW w:w="1951" w:type="dxa"/>
             <w:tcBorders>
               <w:top w:val="single" w:sz="6" w:space="0" w:color="auto"/>
               <w:left w:val="single" w:sz="6" w:space="0" w:color="auto"/>
@@ -2416,7 +2419,7 @@
         </w:tc>
         <w:tc>
           <w:tcPr>
-            <w:tcW w:w="0" w:type="auto"/>
+            <w:tcW w:w="1152" w:type="dxa"/>
             <w:tcBorders>
               <w:top w:val="single" w:sz="6" w:space="0" w:color="auto"/>
               <w:left w:val="single" w:sz="6" w:space="0" w:color="auto"/>
@@ -2536,7 +2539,7 @@
         </w:trPr>
         <w:tc>
           <w:tcPr>
-            <w:tcW w:w="0" w:type="auto"/>
+            <w:tcW w:w="1951" w:type="dxa"/>
             <w:tcBorders>
               <w:top w:val="single" w:sz="6" w:space="0" w:color="auto"/>
               <w:left w:val="single" w:sz="6" w:space="0" w:color="auto"/>
@@ -2573,7 +2576,7 @@
         </w:tc>
         <w:tc>
           <w:tcPr>
-            <w:tcW w:w="0" w:type="auto"/>
+            <w:tcW w:w="1152" w:type="dxa"/>
             <w:tcBorders>
               <w:top w:val="single" w:sz="6" w:space="0" w:color="auto"/>
               <w:left w:val="single" w:sz="6" w:space="0" w:color="auto"/>
@@ -2718,7 +2721,7 @@
         </w:trPr>
         <w:tc>
           <w:tcPr>
-            <w:tcW w:w="0" w:type="auto"/>
+            <w:tcW w:w="1951" w:type="dxa"/>
             <w:tcBorders>
               <w:top w:val="single" w:sz="6" w:space="0" w:color="auto"/>
               <w:left w:val="single" w:sz="6" w:space="0" w:color="auto"/>
@@ -2759,7 +2762,7 @@
         </w:tc>
         <w:tc>
           <w:tcPr>
-            <w:tcW w:w="0" w:type="auto"/>
+            <w:tcW w:w="1152" w:type="dxa"/>
             <w:tcBorders>
               <w:top w:val="single" w:sz="6" w:space="0" w:color="auto"/>
               <w:left w:val="single" w:sz="6" w:space="0" w:color="auto"/>
@@ -2863,14 +2866,7 @@
                 <w:color w:val="1F1F1F"/>
                 <w:bdr w:val="none" w:sz="0" w:space="0" w:color="auto" w:frame="1"/>
               </w:rPr>
-              <w:t xml:space="preserve"> Mongoose Timestamps. Dùng để sort lịch sử</w:t>
-            </w:r>
-            <w:r>
-              <w:rPr>
-                <w:color w:val="1F1F1F"/>
-                <w:bdr w:val="none" w:sz="0" w:space="0" w:color="auto" w:frame="1"/>
-              </w:rPr>
-              <w:t>…</w:t>
+              <w:t xml:space="preserve"> Mongoose Timestamps. Dùng để sort lịch sử…</w:t>
             </w:r>
           </w:p>
         </w:tc>
@@ -4277,7 +4273,7 @@
           <w:color w:val="1F1F1F"/>
         </w:rPr>
         <w:pict w14:anchorId="20BC27CB">
-          <v:rect id="_x0000_i1127" style="width:0;height:1.5pt" o:hralign="center" o:hrstd="t" o:hrnoshade="t" o:hr="t" fillcolor="gray" stroked="f"/>
+          <v:rect id="_x0000_i1028" style="width:0;height:1.5pt" o:hralign="center" o:hrstd="t" o:hrnoshade="t" o:hr="t" fillcolor="gray" stroked="f"/>
         </w:pict>
       </w:r>
     </w:p>
@@ -9066,7 +9062,7 @@
           <w:color w:val="1F1F1F"/>
         </w:rPr>
         <w:pict w14:anchorId="6D4F59E1">
-          <v:rect id="_x0000_i1128" style="width:0;height:1.5pt" o:hralign="center" o:hrstd="t" o:hrnoshade="t" o:hr="t" fillcolor="gray" stroked="f"/>
+          <v:rect id="_x0000_i1029" style="width:0;height:1.5pt" o:hralign="center" o:hrstd="t" o:hrnoshade="t" o:hr="t" fillcolor="gray" stroked="f"/>
         </w:pict>
       </w:r>
     </w:p>
@@ -12559,7 +12555,7 @@
           <w:color w:val="1F1F1F"/>
         </w:rPr>
         <w:pict w14:anchorId="1838035A">
-          <v:rect id="_x0000_i1129" style="width:0;height:1.5pt" o:hralign="center" o:hrstd="t" o:hrnoshade="t" o:hr="t" fillcolor="gray" stroked="f"/>
+          <v:rect id="_x0000_i1030" style="width:0;height:1.5pt" o:hralign="center" o:hrstd="t" o:hrnoshade="t" o:hr="t" fillcolor="gray" stroked="f"/>
         </w:pict>
       </w:r>
     </w:p>
@@ -14944,7 +14940,7 @@
         </w:rPr>
         <w:lastRenderedPageBreak/>
         <w:pict w14:anchorId="37E55BDA">
-          <v:rect id="_x0000_i1130" style="width:0;height:1.5pt" o:hralign="center" o:hrstd="t" o:hrnoshade="t" o:hr="t" fillcolor="gray" stroked="f"/>
+          <v:rect id="_x0000_i1031" style="width:0;height:1.5pt" o:hralign="center" o:hrstd="t" o:hrnoshade="t" o:hr="t" fillcolor="gray" stroked="f"/>
         </w:pict>
       </w:r>
     </w:p>
@@ -15015,10 +15011,10 @@
         <w:tblLook w:val="04A0" w:firstRow="1" w:lastRow="0" w:firstColumn="1" w:lastColumn="0" w:noHBand="0" w:noVBand="1"/>
       </w:tblPr>
       <w:tblGrid>
-        <w:gridCol w:w="2236"/>
+        <w:gridCol w:w="2284"/>
         <w:gridCol w:w="1490"/>
         <w:gridCol w:w="1252"/>
-        <w:gridCol w:w="3423"/>
+        <w:gridCol w:w="4318"/>
       </w:tblGrid>
       <w:tr>
         <w:trPr>
@@ -15585,7 +15581,25 @@
                 <w:color w:val="444746"/>
                 <w:bdr w:val="none" w:sz="0" w:space="0" w:color="auto" w:frame="1"/>
               </w:rPr>
-              <w:t>['User', 'Salon']</w:t>
+              <w:t>['</w:t>
+            </w:r>
+            <w:r>
+              <w:rPr>
+                <w:rStyle w:val="HTMLCode"/>
+                <w:rFonts w:eastAsiaTheme="minorHAnsi"/>
+                <w:color w:val="444746"/>
+                <w:bdr w:val="none" w:sz="0" w:space="0" w:color="auto" w:frame="1"/>
+              </w:rPr>
+              <w:t>Customer</w:t>
+            </w:r>
+            <w:r>
+              <w:rPr>
+                <w:rStyle w:val="HTMLCode"/>
+                <w:rFonts w:eastAsiaTheme="minorHAnsi"/>
+                <w:color w:val="444746"/>
+                <w:bdr w:val="none" w:sz="0" w:space="0" w:color="auto" w:frame="1"/>
+              </w:rPr>
+              <w:t>', 'Salon']</w:t>
             </w:r>
             <w:r>
               <w:rPr>
@@ -15593,6 +15607,142 @@
                 <w:bdr w:val="none" w:sz="0" w:space="0" w:color="auto" w:frame="1"/>
               </w:rPr>
               <w:t>.</w:t>
+            </w:r>
+          </w:p>
+        </w:tc>
+      </w:tr>
+      <w:tr>
+        <w:trPr>
+          <w:tblCellSpacing w:w="15" w:type="dxa"/>
+        </w:trPr>
+        <w:tc>
+          <w:tcPr>
+            <w:tcW w:w="0" w:type="auto"/>
+            <w:tcBorders>
+              <w:top w:val="single" w:sz="6" w:space="0" w:color="auto"/>
+              <w:left w:val="single" w:sz="6" w:space="0" w:color="auto"/>
+              <w:bottom w:val="single" w:sz="6" w:space="0" w:color="auto"/>
+              <w:right w:val="single" w:sz="6" w:space="0" w:color="auto"/>
+            </w:tcBorders>
+            <w:tcMar>
+              <w:top w:w="120" w:type="dxa"/>
+              <w:left w:w="180" w:type="dxa"/>
+              <w:bottom w:w="120" w:type="dxa"/>
+              <w:right w:w="180" w:type="dxa"/>
+            </w:tcMar>
+            <w:vAlign w:val="center"/>
+          </w:tcPr>
+          <w:p>
+            <w:pPr>
+              <w:rPr>
+                <w:rStyle w:val="HTMLCode"/>
+                <w:rFonts w:eastAsiaTheme="minorHAnsi"/>
+                <w:color w:val="444746"/>
+                <w:bdr w:val="none" w:sz="0" w:space="0" w:color="auto" w:frame="1"/>
+              </w:rPr>
+            </w:pPr>
+            <w:r>
+              <w:rPr>
+                <w:rFonts w:ascii="Courier New" w:hAnsi="Courier New" w:cs="Courier New"/>
+              </w:rPr>
+              <w:t>taggedSalonId</w:t>
+            </w:r>
+            <w:r>
+              <w:rPr>
+                <w:rFonts w:ascii="Courier New" w:hAnsi="Courier New" w:cs="Courier New"/>
+              </w:rPr>
+              <w:t>s</w:t>
+            </w:r>
+          </w:p>
+        </w:tc>
+        <w:tc>
+          <w:tcPr>
+            <w:tcW w:w="0" w:type="auto"/>
+            <w:tcBorders>
+              <w:top w:val="single" w:sz="6" w:space="0" w:color="auto"/>
+              <w:left w:val="single" w:sz="6" w:space="0" w:color="auto"/>
+              <w:bottom w:val="single" w:sz="6" w:space="0" w:color="auto"/>
+              <w:right w:val="single" w:sz="6" w:space="0" w:color="auto"/>
+            </w:tcBorders>
+            <w:tcMar>
+              <w:top w:w="120" w:type="dxa"/>
+              <w:left w:w="180" w:type="dxa"/>
+              <w:bottom w:w="120" w:type="dxa"/>
+              <w:right w:w="180" w:type="dxa"/>
+            </w:tcMar>
+            <w:vAlign w:val="center"/>
+          </w:tcPr>
+          <w:p>
+            <w:pPr>
+              <w:rPr>
+                <w:color w:val="1F1F1F"/>
+                <w:bdr w:val="none" w:sz="0" w:space="0" w:color="auto" w:frame="1"/>
+              </w:rPr>
+            </w:pPr>
+            <w:r>
+              <w:t>[ObjectId]</w:t>
+            </w:r>
+          </w:p>
+        </w:tc>
+        <w:tc>
+          <w:tcPr>
+            <w:tcW w:w="0" w:type="auto"/>
+            <w:tcBorders>
+              <w:top w:val="single" w:sz="6" w:space="0" w:color="auto"/>
+              <w:left w:val="single" w:sz="6" w:space="0" w:color="auto"/>
+              <w:bottom w:val="single" w:sz="6" w:space="0" w:color="auto"/>
+              <w:right w:val="single" w:sz="6" w:space="0" w:color="auto"/>
+            </w:tcBorders>
+            <w:tcMar>
+              <w:top w:w="120" w:type="dxa"/>
+              <w:left w:w="180" w:type="dxa"/>
+              <w:bottom w:w="120" w:type="dxa"/>
+              <w:right w:w="180" w:type="dxa"/>
+            </w:tcMar>
+            <w:vAlign w:val="center"/>
+          </w:tcPr>
+          <w:p>
+            <w:pPr>
+              <w:rPr>
+                <w:color w:val="1F1F1F"/>
+                <w:bdr w:val="none" w:sz="0" w:space="0" w:color="auto" w:frame="1"/>
+              </w:rPr>
+            </w:pPr>
+            <w:r>
+              <w:t>No</w:t>
+            </w:r>
+          </w:p>
+        </w:tc>
+        <w:tc>
+          <w:tcPr>
+            <w:tcW w:w="0" w:type="auto"/>
+            <w:tcBorders>
+              <w:top w:val="single" w:sz="6" w:space="0" w:color="auto"/>
+              <w:left w:val="single" w:sz="6" w:space="0" w:color="auto"/>
+              <w:bottom w:val="single" w:sz="6" w:space="0" w:color="auto"/>
+              <w:right w:val="single" w:sz="6" w:space="0" w:color="auto"/>
+            </w:tcBorders>
+            <w:tcMar>
+              <w:top w:w="120" w:type="dxa"/>
+              <w:left w:w="180" w:type="dxa"/>
+              <w:bottom w:w="120" w:type="dxa"/>
+              <w:right w:w="180" w:type="dxa"/>
+            </w:tcMar>
+            <w:vAlign w:val="center"/>
+          </w:tcPr>
+          <w:p>
+            <w:pPr>
+              <w:rPr>
+                <w:rFonts w:ascii="Courier New" w:hAnsi="Courier New" w:cs="Courier New"/>
+              </w:rPr>
+            </w:pPr>
+            <w:proofErr w:type="gramStart"/>
+            <w:r>
+              <w:t>Ref(</w:t>
+            </w:r>
+            <w:proofErr w:type="gramEnd"/>
+            <w:r>
+              <w:t>Salon). Khách dùng Check-in (1 ID). Admin dùng viết bài Top List (Nhiều ID).</w:t>
             </w:r>
           </w:p>
         </w:tc>
@@ -16724,6 +16874,7 @@
                 <w:color w:val="444746"/>
                 <w:bdr w:val="none" w:sz="0" w:space="0" w:color="auto" w:frame="1"/>
               </w:rPr>
+              <w:lastRenderedPageBreak/>
               <w:t>lastMessage</w:t>
             </w:r>
           </w:p>
@@ -16907,7 +17058,6 @@
                 <w:color w:val="444746"/>
                 <w:bdr w:val="none" w:sz="0" w:space="0" w:color="auto" w:frame="1"/>
               </w:rPr>
-              <w:lastRenderedPageBreak/>
               <w:t>createdAt</w:t>
             </w:r>
           </w:p>
@@ -18251,7 +18401,7 @@
           <w:color w:val="1F1F1F"/>
         </w:rPr>
         <w:pict w14:anchorId="750190F6">
-          <v:rect id="_x0000_i1131" style="width:0;height:1.5pt" o:hralign="center" o:hrstd="t" o:hrnoshade="t" o:hr="t" fillcolor="gray" stroked="f"/>
+          <v:rect id="_x0000_i1032" style="width:0;height:1.5pt" o:hralign="center" o:hrstd="t" o:hrnoshade="t" o:hr="t" fillcolor="gray" stroked="f"/>
         </w:pict>
       </w:r>
     </w:p>
@@ -18362,6 +18512,7 @@
                 <w:color w:val="1F1F1F"/>
                 <w:bdr w:val="none" w:sz="0" w:space="0" w:color="auto" w:frame="1"/>
               </w:rPr>
+              <w:lastRenderedPageBreak/>
               <w:t>Field</w:t>
             </w:r>
           </w:p>
@@ -18643,7 +18794,6 @@
                 <w:color w:val="444746"/>
                 <w:bdr w:val="none" w:sz="0" w:space="0" w:color="auto" w:frame="1"/>
               </w:rPr>
-              <w:lastRenderedPageBreak/>
               <w:t>salonId</w:t>
             </w:r>
           </w:p>
@@ -19619,7 +19769,7 @@
           <w:color w:val="1F1F1F"/>
         </w:rPr>
         <w:pict w14:anchorId="5823143E">
-          <v:rect id="_x0000_i1132" style="width:0;height:1.5pt" o:hralign="center" o:hrstd="t" o:hrnoshade="t" o:hr="t" fillcolor="gray" stroked="f"/>
+          <v:rect id="_x0000_i1033" style="width:0;height:1.5pt" o:hralign="center" o:hrstd="t" o:hrnoshade="t" o:hr="t" fillcolor="gray" stroked="f"/>
         </w:pict>
       </w:r>
     </w:p>
@@ -20118,6 +20268,7 @@
                 <w:b/>
                 <w:bCs/>
               </w:rPr>
+              <w:lastRenderedPageBreak/>
               <w:t>Staffs</w:t>
             </w:r>
           </w:p>
@@ -20259,7 +20410,6 @@
                 <w:b/>
                 <w:bCs/>
               </w:rPr>
-              <w:lastRenderedPageBreak/>
               <w:t>Services</w:t>
             </w:r>
           </w:p>
@@ -21544,6 +21694,7 @@
         <w:pStyle w:val="Heading3"/>
       </w:pPr>
       <w:r>
+        <w:lastRenderedPageBreak/>
         <w:t>3. Cụm Inventory (Kho hàng)</w:t>
       </w:r>
     </w:p>
@@ -21858,7 +22009,6 @@
                 <w:b/>
                 <w:bCs/>
               </w:rPr>
-              <w:lastRenderedPageBreak/>
               <w:t>InventoryLogs</w:t>
             </w:r>
           </w:p>
@@ -23293,6 +23443,7 @@
                 <w:b/>
                 <w:bCs/>
               </w:rPr>
+              <w:lastRenderedPageBreak/>
               <w:t>Posts</w:t>
             </w:r>
           </w:p>

</xml_diff>